<commit_message>
updated preliminary results with a new figure
</commit_message>
<xml_diff>
--- a/Preliminary Results.docx
+++ b/Preliminary Results.docx
@@ -759,14 +759,13 @@
           <w:rFonts w:ascii="Times New Roman" w:hAnsi="Times New Roman" w:cs="Times New Roman"/>
           <w:b/>
           <w:bCs/>
-          <w:noProof/>
           <w:color w:val="000000" w:themeColor="text1"/>
         </w:rPr>
         <w:drawing>
-          <wp:inline distT="0" distB="0" distL="0" distR="0" wp14:anchorId="266A6399" wp14:editId="694C5BDE">
-            <wp:extent cx="3784453" cy="1732088"/>
-            <wp:effectExtent l="0" t="0" r="6985" b="1905"/>
-            <wp:docPr id="1483772595" name="Picture 1"/>
+          <wp:inline distT="0" distB="0" distL="0" distR="0" wp14:anchorId="16C10F64" wp14:editId="103A76EA">
+            <wp:extent cx="3276239" cy="1755215"/>
+            <wp:effectExtent l="0" t="0" r="635" b="0"/>
+            <wp:docPr id="1788022311" name="Picture 1"/>
             <wp:cNvGraphicFramePr>
               <a:graphicFrameLocks xmlns:a="http://schemas.openxmlformats.org/drawingml/2006/main" noChangeAspect="1"/>
             </wp:cNvGraphicFramePr>
@@ -774,7 +773,7 @@
               <a:graphicData uri="http://schemas.openxmlformats.org/drawingml/2006/picture">
                 <pic:pic xmlns:pic="http://schemas.openxmlformats.org/drawingml/2006/picture">
                   <pic:nvPicPr>
-                    <pic:cNvPr id="1483772595" name=""/>
+                    <pic:cNvPr id="1788022311" name=""/>
                     <pic:cNvPicPr/>
                   </pic:nvPicPr>
                   <pic:blipFill>
@@ -786,7 +785,7 @@
                   <pic:spPr>
                     <a:xfrm>
                       <a:off x="0" y="0"/>
-                      <a:ext cx="3791180" cy="1735167"/>
+                      <a:ext cx="3285020" cy="1759919"/>
                     </a:xfrm>
                     <a:prstGeom prst="rect">
                       <a:avLst/>

</xml_diff>